<commit_message>
Forgot to update the form here (this is the version on Moodle Esami).
</commit_message>
<xml_diff>
--- a/src/G01HW2/G01HW2form.docx
+++ b/src/G01HW2/G01HW2form.docx
@@ -2361,101 +2361,110 @@
           <w:szCs w:val="20"/>
           <w:lang w:val="en-US"/>
         </w:rPr>
-        <w:t xml:space="preserve"> loop starting at line 141,</w:t>
-      </w:r>
-      <w:r>
-        <w:rPr>
-          <w:bCs/>
-          <w:sz w:val="20"/>
-          <w:szCs w:val="20"/>
-          <w:lang w:val="en-US"/>
-        </w:rPr>
-        <w:t xml:space="preserve"> as well as for</w:t>
-      </w:r>
-      <w:r>
-        <w:rPr>
-          <w:bCs/>
-          <w:sz w:val="20"/>
-          <w:szCs w:val="20"/>
-          <w:lang w:val="en-US"/>
-        </w:rPr>
-        <w:t xml:space="preserve"> output </w:t>
-      </w:r>
-      <w:r>
-        <w:rPr>
-          <w:bCs/>
-          <w:sz w:val="20"/>
-          <w:szCs w:val="20"/>
-          <w:lang w:val="en-US"/>
-        </w:rPr>
-        <w:t xml:space="preserve">values </w:t>
-      </w:r>
-      <w:r>
-        <w:rPr>
-          <w:bCs/>
-          <w:sz w:val="20"/>
-          <w:szCs w:val="20"/>
-          <w:lang w:val="en-US"/>
-        </w:rPr>
-        <w:t>formatting towards the end</w:t>
-      </w:r>
-      <w:r>
-        <w:rPr>
-          <w:bCs/>
-          <w:sz w:val="20"/>
-          <w:szCs w:val="20"/>
-          <w:lang w:val="en-US"/>
-        </w:rPr>
-        <w:t xml:space="preserve"> </w:t>
-      </w:r>
-      <w:r>
-        <w:rPr>
-          <w:bCs/>
-          <w:sz w:val="20"/>
-          <w:szCs w:val="20"/>
-          <w:lang w:val="en-US"/>
-        </w:rPr>
-        <w:t xml:space="preserve">of the </w:t>
-      </w:r>
-      <w:r>
-        <w:rPr>
-          <w:rFonts w:ascii="Lucida Console" w:hAnsi="Lucida Console"/>
-          <w:bCs/>
-          <w:sz w:val="20"/>
-          <w:szCs w:val="20"/>
-          <w:lang w:val="en-US"/>
-        </w:rPr>
-        <w:t>main()</w:t>
-      </w:r>
-      <w:r>
-        <w:rPr>
-          <w:bCs/>
-          <w:sz w:val="20"/>
-          <w:szCs w:val="20"/>
-          <w:lang w:val="en-US"/>
-        </w:rPr>
-        <w:t xml:space="preserve"> </w:t>
-      </w:r>
-      <w:r>
-        <w:rPr>
-          <w:bCs/>
-          <w:sz w:val="20"/>
-          <w:szCs w:val="20"/>
-          <w:lang w:val="en-US"/>
-        </w:rPr>
-        <w:t>method</w:t>
-      </w:r>
-      <w:r>
-        <w:rPr>
-          <w:bCs/>
-          <w:sz w:val="20"/>
-          <w:szCs w:val="20"/>
-          <w:lang w:val="en-US"/>
-        </w:rPr>
-        <w:t>.</w:t>
+        <w:t xml:space="preserve"> loop starting at line 14</w:t>
+      </w:r>
+      <w:r>
+        <w:rPr>
+          <w:bCs/>
+          <w:sz w:val="20"/>
+          <w:szCs w:val="20"/>
+          <w:lang w:val="en-US"/>
+        </w:rPr>
+        <w:t>8</w:t>
       </w:r>
       <w:bookmarkStart w:id="0" w:name="_GoBack"/>
       <w:bookmarkEnd w:id="0"/>
+      <w:r>
+        <w:rPr>
+          <w:bCs/>
+          <w:sz w:val="20"/>
+          <w:szCs w:val="20"/>
+          <w:lang w:val="en-US"/>
+        </w:rPr>
+        <w:t>,</w:t>
+      </w:r>
+      <w:r>
+        <w:rPr>
+          <w:bCs/>
+          <w:sz w:val="20"/>
+          <w:szCs w:val="20"/>
+          <w:lang w:val="en-US"/>
+        </w:rPr>
+        <w:t xml:space="preserve"> as well as for</w:t>
+      </w:r>
+      <w:r>
+        <w:rPr>
+          <w:bCs/>
+          <w:sz w:val="20"/>
+          <w:szCs w:val="20"/>
+          <w:lang w:val="en-US"/>
+        </w:rPr>
+        <w:t xml:space="preserve"> output </w:t>
+      </w:r>
+      <w:r>
+        <w:rPr>
+          <w:bCs/>
+          <w:sz w:val="20"/>
+          <w:szCs w:val="20"/>
+          <w:lang w:val="en-US"/>
+        </w:rPr>
+        <w:t xml:space="preserve">values </w:t>
+      </w:r>
+      <w:r>
+        <w:rPr>
+          <w:bCs/>
+          <w:sz w:val="20"/>
+          <w:szCs w:val="20"/>
+          <w:lang w:val="en-US"/>
+        </w:rPr>
+        <w:t>formatting towards the end</w:t>
+      </w:r>
+      <w:r>
+        <w:rPr>
+          <w:bCs/>
+          <w:sz w:val="20"/>
+          <w:szCs w:val="20"/>
+          <w:lang w:val="en-US"/>
+        </w:rPr>
+        <w:t xml:space="preserve"> of the </w:t>
+      </w:r>
+      <w:r>
+        <w:rPr>
+          <w:rFonts w:ascii="Lucida Console" w:hAnsi="Lucida Console"/>
+          <w:bCs/>
+          <w:sz w:val="20"/>
+          <w:szCs w:val="20"/>
+          <w:lang w:val="en-US"/>
+        </w:rPr>
+        <w:t>main()</w:t>
+      </w:r>
+      <w:r>
+        <w:rPr>
+          <w:bCs/>
+          <w:sz w:val="20"/>
+          <w:szCs w:val="20"/>
+          <w:lang w:val="en-US"/>
+        </w:rPr>
+        <w:t xml:space="preserve"> </w:t>
+      </w:r>
+      <w:r>
+        <w:rPr>
+          <w:bCs/>
+          <w:sz w:val="20"/>
+          <w:szCs w:val="20"/>
+          <w:lang w:val="en-US"/>
+        </w:rPr>
+        <w:t>method</w:t>
+      </w:r>
+      <w:r>
+        <w:rPr>
+          <w:bCs/>
+          <w:sz w:val="20"/>
+          <w:szCs w:val="20"/>
+          <w:lang w:val="en-US"/>
+        </w:rPr>
+        <w:t>.</w:t>
+      </w:r>
     </w:p>
     <w:sectPr>
       <w:pgSz w:w="11906" w:h="16838"/>
@@ -3217,6 +3226,7 @@
   <w:style w:type="character" w:default="1" w:styleId="Carpredefinitoparagrafo">
     <w:name w:val="Default Paragraph Font"/>
     <w:uiPriority w:val="1"/>
+    <w:semiHidden/>
     <w:unhideWhenUsed/>
   </w:style>
   <w:style w:type="table" w:default="1" w:styleId="Tabellanormale">

</xml_diff>